<commit_message>
Term Project Part 1: add student name and ID to title block
Co-authored-by: arena-agent <297053741+arena-agent@users.noreply.github.com>
</commit_message>
<xml_diff>
--- a/term-project-part1/Nubank_Case_Story_Part1.docx
+++ b/term-project-part1/Nubank_Case_Story_Part1.docx
@@ -110,12 +110,22 @@
       <w:r>
         <w:rPr>
           <w:rFonts w:ascii="Calibri" w:hAnsi="Calibri"/>
+          <w:b/>
+          <w:i w:val="0"/>
+          <w:color w:val="1F1F1F"/>
+          <w:sz w:val="21"/>
+        </w:rPr>
+        <w:t>Adrián Corpi Villaseñor</w:t>
+      </w:r>
+      <w:r>
+        <w:rPr>
+          <w:rFonts w:ascii="Calibri" w:hAnsi="Calibri"/>
           <w:b w:val="0"/>
           <w:i w:val="0"/>
-          <w:color w:val="595959"/>
-          <w:sz w:val="20"/>
+          <w:color w:val="1F1F1F"/>
+          <w:sz w:val="21"/>
         </w:rPr>
-        <w:t>Student: ______________________    Student ID: ____________    Professor: ______________________    Date: September 2026</w:t>
+        <w:t xml:space="preserve">  ·  Student ID: AL03044078  ·  September 2026</w:t>
       </w:r>
     </w:p>
     <w:p>

</xml_diff>